<commit_message>
docs: add repository link and author name
</commit_message>
<xml_diff>
--- a/docs/Auth_RBAC_Project_Report.docx
+++ b/docs/Auth_RBAC_Project_Report.docx
@@ -86,10 +86,21 @@
           <w:b/>
           <w:bCs/>
         </w:rPr>
-        <w:t xml:space="preserve">Repository: </w:t>
-      </w:r>
-      <w:r>
-        <w:t>https://github.com/YOUR-USERNAME/YOUR-REPO-NAME</w:t>
+        <w:t>Repository</w:t>
+      </w:r>
+      <w:r>
+        <w:rPr>
+          <w:b/>
+          <w:bCs/>
+        </w:rPr>
+        <w:t xml:space="preserve">: </w:t>
+      </w:r>
+      <w:r>
+        <w:rPr>
+          <w:b/>
+          <w:bCs/>
+        </w:rPr>
+        <w:t>https://github.com/mahinsaleem001-debug/Web_Developer_Varolline_Task2</w:t>
       </w:r>
     </w:p>
     <w:p>
@@ -280,12 +291,6 @@
         <w:gridCol w:w="1900"/>
       </w:tblGrid>
       <w:tr>
-        <w:tblPrEx>
-          <w:tblCellMar>
-            <w:top w:w="0" w:type="dxa"/>
-            <w:bottom w:w="0" w:type="dxa"/>
-          </w:tblCellMar>
-        </w:tblPrEx>
         <w:tc>
           <w:tcPr>
             <w:tcW w:w="3360" w:type="dxa"/>
@@ -413,12 +418,6 @@
         </w:tc>
       </w:tr>
       <w:tr>
-        <w:tblPrEx>
-          <w:tblCellMar>
-            <w:top w:w="0" w:type="dxa"/>
-            <w:bottom w:w="0" w:type="dxa"/>
-          </w:tblCellMar>
-        </w:tblPrEx>
         <w:tc>
           <w:tcPr>
             <w:tcW w:w="3360" w:type="dxa"/>
@@ -534,12 +533,6 @@
         </w:tc>
       </w:tr>
       <w:tr>
-        <w:tblPrEx>
-          <w:tblCellMar>
-            <w:top w:w="0" w:type="dxa"/>
-            <w:bottom w:w="0" w:type="dxa"/>
-          </w:tblCellMar>
-        </w:tblPrEx>
         <w:tc>
           <w:tcPr>
             <w:tcW w:w="3360" w:type="dxa"/>
@@ -655,12 +648,6 @@
         </w:tc>
       </w:tr>
       <w:tr>
-        <w:tblPrEx>
-          <w:tblCellMar>
-            <w:top w:w="0" w:type="dxa"/>
-            <w:bottom w:w="0" w:type="dxa"/>
-          </w:tblCellMar>
-        </w:tblPrEx>
         <w:tc>
           <w:tcPr>
             <w:tcW w:w="3360" w:type="dxa"/>
@@ -846,15 +833,7 @@
       </w:r>
       <w:proofErr w:type="spellEnd"/>
       <w:r>
-        <w:t xml:space="preserve">, so JavaScript on the page cannot steal it. The cookie lasts </w:t>
-      </w:r>
-      <w:proofErr w:type="gramStart"/>
-      <w:r>
-        <w:t>as long as</w:t>
-      </w:r>
-      <w:proofErr w:type="gramEnd"/>
-      <w:r>
-        <w:t xml:space="preserve"> the session, which keeps the user logged in after a refresh or a browser restart.</w:t>
+        <w:t>, so JavaScript on the page cannot steal it. The cookie lasts as long as the session, which keeps the user logged in after a refresh or a browser restart.</w:t>
       </w:r>
     </w:p>
     <w:p>
@@ -990,15 +969,7 @@
         <w:t xml:space="preserve">Simple stack. </w:t>
       </w:r>
       <w:r>
-        <w:t xml:space="preserve">Plain HTML, CSS and JavaScript with no build step, so the project is easy to run and explain. The JWT secret lives </w:t>
-      </w:r>
-      <w:proofErr w:type="gramStart"/>
-      <w:r>
-        <w:t>in .env</w:t>
-      </w:r>
-      <w:proofErr w:type="gramEnd"/>
-      <w:r>
-        <w:t>, which is not committed to Git.</w:t>
+        <w:t>Plain HTML, CSS and JavaScript with no build step, so the project is easy to run and explain. The JWT secret lives in .env, which is not committed to Git.</w:t>
       </w:r>
     </w:p>
     <w:p>
@@ -1095,15 +1066,7 @@
         <w:t xml:space="preserve">Duplicate signups. </w:t>
       </w:r>
       <w:r>
-        <w:t xml:space="preserve">Two people signing up with the same email at the same moment could both pass a check. The store rejects duplicates </w:t>
-      </w:r>
-      <w:proofErr w:type="gramStart"/>
-      <w:r>
-        <w:t>at the moment</w:t>
-      </w:r>
-      <w:proofErr w:type="gramEnd"/>
-      <w:r>
-        <w:t xml:space="preserve"> of saving, and the server answers with a clear error.</w:t>
+        <w:t>Two people signing up with the same email at the same moment could both pass a check. The store rejects duplicates at the moment of saving, and the server answers with a clear error.</w:t>
       </w:r>
     </w:p>
     <w:p>
@@ -1123,19 +1086,11 @@
         <w:t xml:space="preserve">Example secret. </w:t>
       </w:r>
       <w:r>
-        <w:t xml:space="preserve">A </w:t>
-      </w:r>
-      <w:proofErr w:type="gramStart"/>
-      <w:r>
-        <w:t>copied .</w:t>
+        <w:t>A copied .</w:t>
       </w:r>
       <w:proofErr w:type="spellStart"/>
       <w:r>
-        <w:t>env</w:t>
-      </w:r>
-      <w:proofErr w:type="gramEnd"/>
-      <w:r>
-        <w:t>.example</w:t>
+        <w:t>env.example</w:t>
       </w:r>
       <w:proofErr w:type="spellEnd"/>
       <w:r>

</xml_diff>